<commit_message>
feat(mcp): understand_customer — UNDERSTAND package after specific FIND
Seam A FIND is complete (#1535). This starts the Customer Journey with a
grounded three-part package (opportunity says / agency research / emphasize)
and retargets find_opportunities specific _next away from bare get_agency_intel.
Capability statement / Response / Meeting brief remain deferred.

Co-Authored-By: Claude Opus 4.8 (1M context) <noreply@anthropic.com>
Co-authored-by: Cursor <cursoragent@cursor.com>
</commit_message>
<xml_diff>
--- a/docs/marketing/Mindy-MCP-Whitepaper.docx
+++ b/docs/marketing/Mindy-MCP-Whitepaper.docx
@@ -324,7 +324,7 @@
         <w:rPr>
           <w:color w:val="5B34D6"/>
         </w:rPr>
-        <w:t xml:space="preserve">What Mindy MCP gives an agent — 53 tools across four layers</w:t>
+        <w:t xml:space="preserve">What Mindy MCP gives an agent — 60 tools across four layers</w:t>
       </w:r>
     </w:p>
     <w:p>
@@ -4275,7 +4275,7 @@
           <w:b/>
           <w:bCs/>
         </w:rPr>
-        <w:t xml:space="preserve">53 tools</w:t>
+        <w:t xml:space="preserve">60 tools</w:t>
       </w:r>
       <w:r>
         <w:t xml:space="preserve"> spanning the public data any agent needs, a full proposal pipeline, and the proprietary intelligence no competitor can copy, all under a contract that returns real data or honestly returns nothing.</w:t>

</xml_diff>

<commit_message>
feat(market): BigQuery keyword coverage as measurement, not identity
Move get_keyword_coverage to BQ description-match (latest complete FY,
SUM obligation_amount, IDVs included). Neutralize coverage→identity leaks:
profile-from-text keeps company naics empty and surfaces coverageCandidates;
market-overview routes tiles via corroborated NAICS or keyword language;
beginner relevance uses coverage sector as a signal, not a peak-sector gate.

Co-Authored-By: Claude Opus 4.8 (1M context) <noreply@anthropic.com>
Co-authored-by: Cursor <cursoragent@cursor.com>
</commit_message>
<xml_diff>
--- a/docs/marketing/Mindy-MCP-Whitepaper.docx
+++ b/docs/marketing/Mindy-MCP-Whitepaper.docx
@@ -324,7 +324,7 @@
         <w:rPr>
           <w:color w:val="5B34D6"/>
         </w:rPr>
-        <w:t xml:space="preserve">What Mindy MCP gives an agent — 61 tools across four layers</w:t>
+        <w:t xml:space="preserve">What Mindy MCP gives an agent — 63 tools across four layers</w:t>
       </w:r>
     </w:p>
     <w:p>
@@ -343,7 +343,29 @@
         <w:t xml:space="preserve">get_current_acquisition_intelligence</w:t>
       </w:r>
       <w:r>
-        <w:t xml:space="preserve"> (8 credits) — what changed about how a buyer is buying for a capability, and what to do differently (LIVE compose only).</w:t>
+        <w:t xml:space="preserve"> (8 credits) — what changed about how a buyer is buying for a capability, and what to do differently (LIVE compose only). </w:t>
+      </w:r>
+      <w:r>
+        <w:rPr>
+          <w:rFonts w:ascii="Consolas" w:cs="Consolas" w:eastAsia="Consolas" w:hAnsi="Consolas"/>
+          <w:color w:val="5B34D6"/>
+          <w:shd w:fill="EEF1F8"/>
+        </w:rPr>
+        <w:t xml:space="preserve">match_company_to_pathways</w:t>
+      </w:r>
+      <w:r>
+        <w:t xml:space="preserve"> (8 credits) — which of those doors a company’s public record can support (two-sided PATHWAY FIT; </w:t>
+      </w:r>
+      <w:r>
+        <w:rPr>
+          <w:rFonts w:ascii="Consolas" w:cs="Consolas" w:eastAsia="Consolas" w:hAnsi="Consolas"/>
+          <w:color w:val="5B34D6"/>
+          <w:shd w:fill="EEF1F8"/>
+        </w:rPr>
+        <w:t xml:space="preserve">no_proven_door</w:t>
+      </w:r>
+      <w:r>
+        <w:t xml:space="preserve"> is success).</w:t>
       </w:r>
     </w:p>
     <w:p>
@@ -534,28 +556,28 @@
                 <w:color w:val="5B34D6"/>
                 <w:shd w:fill="EEF1F8"/>
               </w:rPr>
-              <w:t xml:space="preserve">get_market_vocabulary</w:t>
-            </w:r>
-          </w:p>
-        </w:tc>
-        <w:tc>
-          <w:tcPr>
-            <w:tcBorders>
-              <w:top w:val="single" w:color="D5D9E4" w:sz="4"/>
-              <w:left w:val="single" w:color="D5D9E4" w:sz="4"/>
-              <w:bottom w:val="single" w:color="D5D9E4" w:sz="4"/>
-              <w:right w:val="single" w:color="D5D9E4" w:sz="4"/>
-            </w:tcBorders>
-            <w:tcMar>
-              <w:top w:type="dxa" w:w="60"/>
-              <w:left w:type="dxa" w:w="120"/>
-              <w:bottom w:type="dxa" w:w="60"/>
-              <w:right w:type="dxa" w:w="120"/>
-            </w:tcMar>
-          </w:tcPr>
-          <w:p>
-            <w:r>
-              <w:t xml:space="preserve">The real terms buyers use for a market</w:t>
+              <w:t xml:space="preserve">lookup_solicitation</w:t>
+            </w:r>
+          </w:p>
+        </w:tc>
+        <w:tc>
+          <w:tcPr>
+            <w:tcBorders>
+              <w:top w:val="single" w:color="D5D9E4" w:sz="4"/>
+              <w:left w:val="single" w:color="D5D9E4" w:sz="4"/>
+              <w:bottom w:val="single" w:color="D5D9E4" w:sz="4"/>
+              <w:right w:val="single" w:color="D5D9E4" w:sz="4"/>
+            </w:tcBorders>
+            <w:tcMar>
+              <w:top w:type="dxa" w:w="60"/>
+              <w:left w:type="dxa" w:w="120"/>
+              <w:bottom w:type="dxa" w:w="60"/>
+              <w:right w:type="dxa" w:w="120"/>
+            </w:tcMar>
+          </w:tcPr>
+          <w:p>
+            <w:r>
+              <w:t xml:space="preserve">Historical or known-id solicitation lookup — closed ≠ gone</w:t>
             </w:r>
           </w:p>
         </w:tc>
@@ -583,28 +605,28 @@
                 <w:color w:val="5B34D6"/>
                 <w:shd w:fill="EEF1F8"/>
               </w:rPr>
-              <w:t xml:space="preserve">get_keyword_coverage</w:t>
-            </w:r>
-          </w:p>
-        </w:tc>
-        <w:tc>
-          <w:tcPr>
-            <w:tcBorders>
-              <w:top w:val="single" w:color="D5D9E4" w:sz="4"/>
-              <w:left w:val="single" w:color="D5D9E4" w:sz="4"/>
-              <w:bottom w:val="single" w:color="D5D9E4" w:sz="4"/>
-              <w:right w:val="single" w:color="D5D9E4" w:sz="4"/>
-            </w:tcBorders>
-            <w:tcMar>
-              <w:top w:type="dxa" w:w="60"/>
-              <w:left w:type="dxa" w:w="120"/>
-              <w:bottom w:type="dxa" w:w="60"/>
-              <w:right w:type="dxa" w:w="120"/>
-            </w:tcMar>
-          </w:tcPr>
-          <w:p>
-            <w:r>
-              <w:t xml:space="preserve">Total market $ for a product + every buying NAICS ("NAICS is the wrong primary key")</w:t>
+              <w:t xml:space="preserve">get_market_vocabulary</w:t>
+            </w:r>
+          </w:p>
+        </w:tc>
+        <w:tc>
+          <w:tcPr>
+            <w:tcBorders>
+              <w:top w:val="single" w:color="D5D9E4" w:sz="4"/>
+              <w:left w:val="single" w:color="D5D9E4" w:sz="4"/>
+              <w:bottom w:val="single" w:color="D5D9E4" w:sz="4"/>
+              <w:right w:val="single" w:color="D5D9E4" w:sz="4"/>
+            </w:tcBorders>
+            <w:tcMar>
+              <w:top w:type="dxa" w:w="60"/>
+              <w:left w:type="dxa" w:w="120"/>
+              <w:bottom w:type="dxa" w:w="60"/>
+              <w:right w:type="dxa" w:w="120"/>
+            </w:tcMar>
+          </w:tcPr>
+          <w:p>
+            <w:r>
+              <w:t xml:space="preserve">The real terms buyers use for a market</w:t>
             </w:r>
           </w:p>
         </w:tc>
@@ -632,28 +654,28 @@
                 <w:color w:val="5B34D6"/>
                 <w:shd w:fill="EEF1F8"/>
               </w:rPr>
-              <w:t xml:space="preserve">search_grants</w:t>
-            </w:r>
-          </w:p>
-        </w:tc>
-        <w:tc>
-          <w:tcPr>
-            <w:tcBorders>
-              <w:top w:val="single" w:color="D5D9E4" w:sz="4"/>
-              <w:left w:val="single" w:color="D5D9E4" w:sz="4"/>
-              <w:bottom w:val="single" w:color="D5D9E4" w:sz="4"/>
-              <w:right w:val="single" w:color="D5D9E4" w:sz="4"/>
-            </w:tcBorders>
-            <w:tcMar>
-              <w:top w:type="dxa" w:w="60"/>
-              <w:left w:type="dxa" w:w="120"/>
-              <w:bottom w:type="dxa" w:w="60"/>
-              <w:right w:type="dxa" w:w="120"/>
-            </w:tcMar>
-          </w:tcPr>
-          <w:p>
-            <w:r>
-              <w:t xml:space="preserve">Federal grant (assistance) opportunities</w:t>
+              <w:t xml:space="preserve">get_keyword_coverage</w:t>
+            </w:r>
+          </w:p>
+        </w:tc>
+        <w:tc>
+          <w:tcPr>
+            <w:tcBorders>
+              <w:top w:val="single" w:color="D5D9E4" w:sz="4"/>
+              <w:left w:val="single" w:color="D5D9E4" w:sz="4"/>
+              <w:bottom w:val="single" w:color="D5D9E4" w:sz="4"/>
+              <w:right w:val="single" w:color="D5D9E4" w:sz="4"/>
+            </w:tcBorders>
+            <w:tcMar>
+              <w:top w:type="dxa" w:w="60"/>
+              <w:left w:type="dxa" w:w="120"/>
+              <w:bottom w:type="dxa" w:w="60"/>
+              <w:right w:type="dxa" w:w="120"/>
+            </w:tcMar>
+          </w:tcPr>
+          <w:p>
+            <w:r>
+              <w:t xml:space="preserve">Measured FY description-match market $ + NAICS/PSC distribution (shares are not market identity; does not set company NAICS, forecast/recompete scope, or opportunity eligibility)</w:t>
             </w:r>
           </w:p>
         </w:tc>
@@ -681,28 +703,28 @@
                 <w:color w:val="5B34D6"/>
                 <w:shd w:fill="EEF1F8"/>
               </w:rPr>
-              <w:t xml:space="preserve">get_agency_forecasts</w:t>
-            </w:r>
-          </w:p>
-        </w:tc>
-        <w:tc>
-          <w:tcPr>
-            <w:tcBorders>
-              <w:top w:val="single" w:color="D5D9E4" w:sz="4"/>
-              <w:left w:val="single" w:color="D5D9E4" w:sz="4"/>
-              <w:bottom w:val="single" w:color="D5D9E4" w:sz="4"/>
-              <w:right w:val="single" w:color="D5D9E4" w:sz="4"/>
-            </w:tcBorders>
-            <w:tcMar>
-              <w:top w:type="dxa" w:w="60"/>
-              <w:left w:type="dxa" w:w="120"/>
-              <w:bottom w:type="dxa" w:w="60"/>
-              <w:right w:type="dxa" w:w="120"/>
-            </w:tcMar>
-          </w:tcPr>
-          <w:p>
-            <w:r>
-              <w:t xml:space="preserve">Planned procurements 6–18 months before solicitation</w:t>
+              <w:t xml:space="preserve">search_grants</w:t>
+            </w:r>
+          </w:p>
+        </w:tc>
+        <w:tc>
+          <w:tcPr>
+            <w:tcBorders>
+              <w:top w:val="single" w:color="D5D9E4" w:sz="4"/>
+              <w:left w:val="single" w:color="D5D9E4" w:sz="4"/>
+              <w:bottom w:val="single" w:color="D5D9E4" w:sz="4"/>
+              <w:right w:val="single" w:color="D5D9E4" w:sz="4"/>
+            </w:tcBorders>
+            <w:tcMar>
+              <w:top w:type="dxa" w:w="60"/>
+              <w:left w:type="dxa" w:w="120"/>
+              <w:bottom w:type="dxa" w:w="60"/>
+              <w:right w:type="dxa" w:w="120"/>
+            </w:tcMar>
+          </w:tcPr>
+          <w:p>
+            <w:r>
+              <w:t xml:space="preserve">Federal grant (assistance) opportunities</w:t>
             </w:r>
           </w:p>
         </w:tc>
@@ -730,28 +752,28 @@
                 <w:color w:val="5B34D6"/>
                 <w:shd w:fill="EEF1F8"/>
               </w:rPr>
-              <w:t xml:space="preserve">search_sbir</w:t>
-            </w:r>
-          </w:p>
-        </w:tc>
-        <w:tc>
-          <w:tcPr>
-            <w:tcBorders>
-              <w:top w:val="single" w:color="D5D9E4" w:sz="4"/>
-              <w:left w:val="single" w:color="D5D9E4" w:sz="4"/>
-              <w:bottom w:val="single" w:color="D5D9E4" w:sz="4"/>
-              <w:right w:val="single" w:color="D5D9E4" w:sz="4"/>
-            </w:tcBorders>
-            <w:tcMar>
-              <w:top w:type="dxa" w:w="60"/>
-              <w:left w:type="dxa" w:w="120"/>
-              <w:bottom w:type="dxa" w:w="60"/>
-              <w:right w:type="dxa" w:w="120"/>
-            </w:tcMar>
-          </w:tcPr>
-          <w:p>
-            <w:r>
-              <w:t xml:space="preserve">SBIR/STTR small-business R&amp;D awards + open notices</w:t>
+              <w:t xml:space="preserve">get_agency_forecasts</w:t>
+            </w:r>
+          </w:p>
+        </w:tc>
+        <w:tc>
+          <w:tcPr>
+            <w:tcBorders>
+              <w:top w:val="single" w:color="D5D9E4" w:sz="4"/>
+              <w:left w:val="single" w:color="D5D9E4" w:sz="4"/>
+              <w:bottom w:val="single" w:color="D5D9E4" w:sz="4"/>
+              <w:right w:val="single" w:color="D5D9E4" w:sz="4"/>
+            </w:tcBorders>
+            <w:tcMar>
+              <w:top w:type="dxa" w:w="60"/>
+              <w:left w:type="dxa" w:w="120"/>
+              <w:bottom w:type="dxa" w:w="60"/>
+              <w:right w:type="dxa" w:w="120"/>
+            </w:tcMar>
+          </w:tcPr>
+          <w:p>
+            <w:r>
+              <w:t xml:space="preserve">Planned procurements 6–18 months before solicitation</w:t>
             </w:r>
           </w:p>
         </w:tc>
@@ -779,6 +801,55 @@
                 <w:color w:val="5B34D6"/>
                 <w:shd w:fill="EEF1F8"/>
               </w:rPr>
+              <w:t xml:space="preserve">search_sbir</w:t>
+            </w:r>
+          </w:p>
+        </w:tc>
+        <w:tc>
+          <w:tcPr>
+            <w:tcBorders>
+              <w:top w:val="single" w:color="D5D9E4" w:sz="4"/>
+              <w:left w:val="single" w:color="D5D9E4" w:sz="4"/>
+              <w:bottom w:val="single" w:color="D5D9E4" w:sz="4"/>
+              <w:right w:val="single" w:color="D5D9E4" w:sz="4"/>
+            </w:tcBorders>
+            <w:tcMar>
+              <w:top w:type="dxa" w:w="60"/>
+              <w:left w:type="dxa" w:w="120"/>
+              <w:bottom w:type="dxa" w:w="60"/>
+              <w:right w:type="dxa" w:w="120"/>
+            </w:tcMar>
+          </w:tcPr>
+          <w:p>
+            <w:r>
+              <w:t xml:space="preserve">SBIR/STTR small-business R&amp;D awards + open notices</w:t>
+            </w:r>
+          </w:p>
+        </w:tc>
+      </w:tr>
+      <w:tr>
+        <w:tc>
+          <w:tcPr>
+            <w:tcBorders>
+              <w:top w:val="single" w:color="D5D9E4" w:sz="4"/>
+              <w:left w:val="single" w:color="D5D9E4" w:sz="4"/>
+              <w:bottom w:val="single" w:color="D5D9E4" w:sz="4"/>
+              <w:right w:val="single" w:color="D5D9E4" w:sz="4"/>
+            </w:tcBorders>
+            <w:tcMar>
+              <w:top w:type="dxa" w:w="60"/>
+              <w:left w:type="dxa" w:w="120"/>
+              <w:bottom w:type="dxa" w:w="60"/>
+              <w:right w:type="dxa" w:w="120"/>
+            </w:tcMar>
+          </w:tcPr>
+          <w:p>
+            <w:r>
+              <w:rPr>
+                <w:rFonts w:ascii="Consolas" w:cs="Consolas" w:eastAsia="Consolas" w:hAnsi="Consolas"/>
+                <w:color w:val="5B34D6"/>
+                <w:shd w:fill="EEF1F8"/>
+              </w:rPr>
               <w:t xml:space="preserve">get_current_acquisition_intelligence</w:t>
             </w:r>
           </w:p>
@@ -801,6 +872,55 @@
           <w:p>
             <w:r>
               <w:t xml:space="preserve">What changed about how a buyer is buying + what to do differently (LIVE)</w:t>
+            </w:r>
+          </w:p>
+        </w:tc>
+      </w:tr>
+      <w:tr>
+        <w:tc>
+          <w:tcPr>
+            <w:tcBorders>
+              <w:top w:val="single" w:color="D5D9E4" w:sz="4"/>
+              <w:left w:val="single" w:color="D5D9E4" w:sz="4"/>
+              <w:bottom w:val="single" w:color="D5D9E4" w:sz="4"/>
+              <w:right w:val="single" w:color="D5D9E4" w:sz="4"/>
+            </w:tcBorders>
+            <w:tcMar>
+              <w:top w:type="dxa" w:w="60"/>
+              <w:left w:type="dxa" w:w="120"/>
+              <w:bottom w:type="dxa" w:w="60"/>
+              <w:right w:type="dxa" w:w="120"/>
+            </w:tcMar>
+          </w:tcPr>
+          <w:p>
+            <w:r>
+              <w:rPr>
+                <w:rFonts w:ascii="Consolas" w:cs="Consolas" w:eastAsia="Consolas" w:hAnsi="Consolas"/>
+                <w:color w:val="5B34D6"/>
+                <w:shd w:fill="EEF1F8"/>
+              </w:rPr>
+              <w:t xml:space="preserve">match_company_to_pathways</w:t>
+            </w:r>
+          </w:p>
+        </w:tc>
+        <w:tc>
+          <w:tcPr>
+            <w:tcBorders>
+              <w:top w:val="single" w:color="D5D9E4" w:sz="4"/>
+              <w:left w:val="single" w:color="D5D9E4" w:sz="4"/>
+              <w:bottom w:val="single" w:color="D5D9E4" w:sz="4"/>
+              <w:right w:val="single" w:color="D5D9E4" w:sz="4"/>
+            </w:tcBorders>
+            <w:tcMar>
+              <w:top w:type="dxa" w:w="60"/>
+              <w:left w:type="dxa" w:w="120"/>
+              <w:bottom w:type="dxa" w:w="60"/>
+              <w:right w:type="dxa" w:w="120"/>
+            </w:tcMar>
+          </w:tcPr>
+          <w:p>
+            <w:r>
+              <w:t xml:space="preserve">Which CAI doors a company’s public record can support (PATHWAY FIT)</w:t>
             </w:r>
           </w:p>
         </w:tc>
@@ -4343,7 +4463,7 @@
           <w:b/>
           <w:bCs/>
         </w:rPr>
-        <w:t xml:space="preserve">61 tools</w:t>
+        <w:t xml:space="preserve">63 tools</w:t>
       </w:r>
       <w:r>
         <w:t xml:space="preserve"> spanning the public data any agent needs, a full proposal pipeline, and the proprietary intelligence no competitor can copy, all under a contract that returns real data or honestly returns nothing.</w:t>

</xml_diff>

<commit_message>
chore(mcp): retire search_sbir — absent from discovery, stale calls answered uncharged
search_sbir could not return open SBIR/STTR topics (investigation: PR #1708).
Withdraw the published tool; keep every shared library and stored record.

- Removed from the registry, TOOL_CREDITS, TOOL_META, tool groups, the stdio
  server, the catalog mirror, whitepaper (+docx), changelog, README and smoke.
- New src/lib/mcp/retired-tools.ts. The hosted edge answers a stale
  tools/call (after auth, before the SDK) with a clear `tool_retired` result,
  isError:false, 0 credits, logged status='retired'. runMeteredTool refuses a
  retired name before pricing/balance/debit on every other entry point.
- Guard: a test fails if a retired name is ever registered again.
- Kept: src/lib/sbir/*, the in-app SBIR panel and /api/sbir, all stored data,
  the unregistered wrapper, parked feeds.

Co-Authored-By: Claude Opus 5.5 (1M context) <noreply@anthropic.com>
</commit_message>
<xml_diff>
--- a/docs/marketing/Mindy-MCP-Whitepaper.docx
+++ b/docs/marketing/Mindy-MCP-Whitepaper.docx
@@ -324,7 +324,7 @@
         <w:rPr>
           <w:color w:val="5B34D6"/>
         </w:rPr>
-        <w:t xml:space="preserve">What Mindy MCP gives an agent — 64 tools across four layers</w:t>
+        <w:t xml:space="preserve">What Mindy MCP gives an agent — 63 tools across four layers</w:t>
       </w:r>
     </w:p>
     <w:p>
@@ -801,55 +801,6 @@
                 <w:color w:val="5B34D6"/>
                 <w:shd w:fill="EEF1F8"/>
               </w:rPr>
-              <w:t xml:space="preserve">search_sbir</w:t>
-            </w:r>
-          </w:p>
-        </w:tc>
-        <w:tc>
-          <w:tcPr>
-            <w:tcBorders>
-              <w:top w:val="single" w:color="D5D9E4" w:sz="4"/>
-              <w:left w:val="single" w:color="D5D9E4" w:sz="4"/>
-              <w:bottom w:val="single" w:color="D5D9E4" w:sz="4"/>
-              <w:right w:val="single" w:color="D5D9E4" w:sz="4"/>
-            </w:tcBorders>
-            <w:tcMar>
-              <w:top w:type="dxa" w:w="60"/>
-              <w:left w:type="dxa" w:w="120"/>
-              <w:bottom w:type="dxa" w:w="60"/>
-              <w:right w:type="dxa" w:w="120"/>
-            </w:tcMar>
-          </w:tcPr>
-          <w:p>
-            <w:r>
-              <w:t xml:space="preserve">SBIR/STTR small-business R&amp;D awards + open notices</w:t>
-            </w:r>
-          </w:p>
-        </w:tc>
-      </w:tr>
-      <w:tr>
-        <w:tc>
-          <w:tcPr>
-            <w:tcBorders>
-              <w:top w:val="single" w:color="D5D9E4" w:sz="4"/>
-              <w:left w:val="single" w:color="D5D9E4" w:sz="4"/>
-              <w:bottom w:val="single" w:color="D5D9E4" w:sz="4"/>
-              <w:right w:val="single" w:color="D5D9E4" w:sz="4"/>
-            </w:tcBorders>
-            <w:tcMar>
-              <w:top w:type="dxa" w:w="60"/>
-              <w:left w:type="dxa" w:w="120"/>
-              <w:bottom w:type="dxa" w:w="60"/>
-              <w:right w:type="dxa" w:w="120"/>
-            </w:tcMar>
-          </w:tcPr>
-          <w:p>
-            <w:r>
-              <w:rPr>
-                <w:rFonts w:ascii="Consolas" w:cs="Consolas" w:eastAsia="Consolas" w:hAnsi="Consolas"/>
-                <w:color w:val="5B34D6"/>
-                <w:shd w:fill="EEF1F8"/>
-              </w:rPr>
               <w:t xml:space="preserve">get_current_acquisition_intelligence</w:t>
             </w:r>
           </w:p>
@@ -4381,28 +4332,28 @@
                 <w:b/>
                 <w:bCs/>
               </w:rPr>
-              <w:t xml:space="preserve">Grants.gov / NIH RePORTER</w:t>
-            </w:r>
-          </w:p>
-        </w:tc>
-        <w:tc>
-          <w:tcPr>
-            <w:tcBorders>
-              <w:top w:val="single" w:color="D5D9E4" w:sz="4"/>
-              <w:left w:val="single" w:color="D5D9E4" w:sz="4"/>
-              <w:bottom w:val="single" w:color="D5D9E4" w:sz="4"/>
-              <w:right w:val="single" w:color="D5D9E4" w:sz="4"/>
-            </w:tcBorders>
-            <w:tcMar>
-              <w:top w:type="dxa" w:w="60"/>
-              <w:left w:type="dxa" w:w="120"/>
-              <w:bottom w:type="dxa" w:w="60"/>
-              <w:right w:type="dxa" w:w="120"/>
-            </w:tcMar>
-          </w:tcPr>
-          <w:p>
-            <w:r>
-              <w:t xml:space="preserve">Grants + SBIR/STTR</w:t>
+              <w:t xml:space="preserve">Grants.gov</w:t>
+            </w:r>
+          </w:p>
+        </w:tc>
+        <w:tc>
+          <w:tcPr>
+            <w:tcBorders>
+              <w:top w:val="single" w:color="D5D9E4" w:sz="4"/>
+              <w:left w:val="single" w:color="D5D9E4" w:sz="4"/>
+              <w:bottom w:val="single" w:color="D5D9E4" w:sz="4"/>
+              <w:right w:val="single" w:color="D5D9E4" w:sz="4"/>
+            </w:tcBorders>
+            <w:tcMar>
+              <w:top w:type="dxa" w:w="60"/>
+              <w:left w:type="dxa" w:w="120"/>
+              <w:bottom w:type="dxa" w:w="60"/>
+              <w:right w:type="dxa" w:w="120"/>
+            </w:tcMar>
+          </w:tcPr>
+          <w:p>
+            <w:r>
+              <w:t xml:space="preserve">Grants</w:t>
             </w:r>
           </w:p>
         </w:tc>
@@ -4512,7 +4463,7 @@
           <w:b/>
           <w:bCs/>
         </w:rPr>
-        <w:t xml:space="preserve">64 tools</w:t>
+        <w:t xml:space="preserve">63 tools</w:t>
       </w:r>
       <w:r>
         <w:t xml:space="preserve"> spanning the public data any agent needs, a full proposal pipeline, and the proprietary intelligence no competitor can copy, all under a contract that returns real data or honestly returns nothing.</w:t>

</xml_diff>

<commit_message>
docs(mcp): regenerate Tool Map from the public catalog (53), sync mirror/whitepaper, correct billing copy
- scripts/build-tool-map-artifact.ts renders the claude.ai Tool Map from what external
  hosts receive (mcpRegistrationList + listPublicMcpTools), lanes from TOOL_GROUPS. It
  refuses to build if a public tool has no card line or a line names a non-public tool.
  The live map had drifted to 54 tools with wrong prices while the mirror said 64.
- Drift gate now also checks docs/mcp-tool-map.html against the public catalog.
- Mirror, whitepaper (count + body) and .docx synced to 53; changelog entry added.
- /mcp/pricing + whitepaper: "a failed or empty call costs nothing" and "cached reads
  are free" were false. Measured zero-result answers are billed; refusals / no-work
  calls are not; a repeated call is charged again.

Co-Authored-By: Claude Opus 4.8 (1M context) <noreply@anthropic.com>
</commit_message>
<xml_diff>
--- a/docs/marketing/Mindy-MCP-Whitepaper.docx
+++ b/docs/marketing/Mindy-MCP-Whitepaper.docx
@@ -324,7 +324,7 @@
         <w:rPr>
           <w:color w:val="5B34D6"/>
         </w:rPr>
-        <w:t xml:space="preserve">What Mindy MCP gives an agent — 64 tools across four layers</w:t>
+        <w:t xml:space="preserve">What Mindy MCP gives an agent — 53 tools across four layers</w:t>
       </w:r>
     </w:p>
     <w:p>
@@ -801,28 +801,28 @@
                 <w:color w:val="5B34D6"/>
                 <w:shd w:fill="EEF1F8"/>
               </w:rPr>
-              <w:t xml:space="preserve">search_sbir</w:t>
-            </w:r>
-          </w:p>
-        </w:tc>
-        <w:tc>
-          <w:tcPr>
-            <w:tcBorders>
-              <w:top w:val="single" w:color="D5D9E4" w:sz="4"/>
-              <w:left w:val="single" w:color="D5D9E4" w:sz="4"/>
-              <w:bottom w:val="single" w:color="D5D9E4" w:sz="4"/>
-              <w:right w:val="single" w:color="D5D9E4" w:sz="4"/>
-            </w:tcBorders>
-            <w:tcMar>
-              <w:top w:type="dxa" w:w="60"/>
-              <w:left w:type="dxa" w:w="120"/>
-              <w:bottom w:type="dxa" w:w="60"/>
-              <w:right w:type="dxa" w:w="120"/>
-            </w:tcMar>
-          </w:tcPr>
-          <w:p>
-            <w:r>
-              <w:t xml:space="preserve">SBIR/STTR small-business R&amp;D awards + open notices</w:t>
+              <w:t xml:space="preserve">get_current_acquisition_intelligence</w:t>
+            </w:r>
+          </w:p>
+        </w:tc>
+        <w:tc>
+          <w:tcPr>
+            <w:tcBorders>
+              <w:top w:val="single" w:color="D5D9E4" w:sz="4"/>
+              <w:left w:val="single" w:color="D5D9E4" w:sz="4"/>
+              <w:bottom w:val="single" w:color="D5D9E4" w:sz="4"/>
+              <w:right w:val="single" w:color="D5D9E4" w:sz="4"/>
+            </w:tcBorders>
+            <w:tcMar>
+              <w:top w:type="dxa" w:w="60"/>
+              <w:left w:type="dxa" w:w="120"/>
+              <w:bottom w:type="dxa" w:w="60"/>
+              <w:right w:type="dxa" w:w="120"/>
+            </w:tcMar>
+          </w:tcPr>
+          <w:p>
+            <w:r>
+              <w:t xml:space="preserve">What changed about how a buyer is buying + what to do differently (LIVE)</w:t>
             </w:r>
           </w:p>
         </w:tc>
@@ -850,28 +850,28 @@
                 <w:color w:val="5B34D6"/>
                 <w:shd w:fill="EEF1F8"/>
               </w:rPr>
-              <w:t xml:space="preserve">get_current_acquisition_intelligence</w:t>
-            </w:r>
-          </w:p>
-        </w:tc>
-        <w:tc>
-          <w:tcPr>
-            <w:tcBorders>
-              <w:top w:val="single" w:color="D5D9E4" w:sz="4"/>
-              <w:left w:val="single" w:color="D5D9E4" w:sz="4"/>
-              <w:bottom w:val="single" w:color="D5D9E4" w:sz="4"/>
-              <w:right w:val="single" w:color="D5D9E4" w:sz="4"/>
-            </w:tcBorders>
-            <w:tcMar>
-              <w:top w:type="dxa" w:w="60"/>
-              <w:left w:type="dxa" w:w="120"/>
-              <w:bottom w:type="dxa" w:w="60"/>
-              <w:right w:type="dxa" w:w="120"/>
-            </w:tcMar>
-          </w:tcPr>
-          <w:p>
-            <w:r>
-              <w:t xml:space="preserve">What changed about how a buyer is buying + what to do differently (LIVE)</w:t>
+              <w:t xml:space="preserve">match_company_to_pathways</w:t>
+            </w:r>
+          </w:p>
+        </w:tc>
+        <w:tc>
+          <w:tcPr>
+            <w:tcBorders>
+              <w:top w:val="single" w:color="D5D9E4" w:sz="4"/>
+              <w:left w:val="single" w:color="D5D9E4" w:sz="4"/>
+              <w:bottom w:val="single" w:color="D5D9E4" w:sz="4"/>
+              <w:right w:val="single" w:color="D5D9E4" w:sz="4"/>
+            </w:tcBorders>
+            <w:tcMar>
+              <w:top w:type="dxa" w:w="60"/>
+              <w:left w:type="dxa" w:w="120"/>
+              <w:bottom w:type="dxa" w:w="60"/>
+              <w:right w:type="dxa" w:w="120"/>
+            </w:tcMar>
+          </w:tcPr>
+          <w:p>
+            <w:r>
+              <w:t xml:space="preserve">Which CAI doors a company’s public record can support (PATHWAY FIT)</w:t>
             </w:r>
           </w:p>
         </w:tc>
@@ -899,28 +899,28 @@
                 <w:color w:val="5B34D6"/>
                 <w:shd w:fill="EEF1F8"/>
               </w:rPr>
-              <w:t xml:space="preserve">match_company_to_pathways</w:t>
-            </w:r>
-          </w:p>
-        </w:tc>
-        <w:tc>
-          <w:tcPr>
-            <w:tcBorders>
-              <w:top w:val="single" w:color="D5D9E4" w:sz="4"/>
-              <w:left w:val="single" w:color="D5D9E4" w:sz="4"/>
-              <w:bottom w:val="single" w:color="D5D9E4" w:sz="4"/>
-              <w:right w:val="single" w:color="D5D9E4" w:sz="4"/>
-            </w:tcBorders>
-            <w:tcMar>
-              <w:top w:type="dxa" w:w="60"/>
-              <w:left w:type="dxa" w:w="120"/>
-              <w:bottom w:type="dxa" w:w="60"/>
-              <w:right w:type="dxa" w:w="120"/>
-            </w:tcMar>
-          </w:tcPr>
-          <w:p>
-            <w:r>
-              <w:t xml:space="preserve">Which CAI doors a company’s public record can support (PATHWAY FIT)</w:t>
+              <w:t xml:space="preserve">get_expiring_contracts</w:t>
+            </w:r>
+          </w:p>
+        </w:tc>
+        <w:tc>
+          <w:tcPr>
+            <w:tcBorders>
+              <w:top w:val="single" w:color="D5D9E4" w:sz="4"/>
+              <w:left w:val="single" w:color="D5D9E4" w:sz="4"/>
+              <w:bottom w:val="single" w:color="D5D9E4" w:sz="4"/>
+              <w:right w:val="single" w:color="D5D9E4" w:sz="4"/>
+            </w:tcBorders>
+            <w:tcMar>
+              <w:top w:type="dxa" w:w="60"/>
+              <w:left w:type="dxa" w:w="120"/>
+              <w:bottom w:type="dxa" w:w="60"/>
+              <w:right w:type="dxa" w:w="120"/>
+            </w:tcMar>
+          </w:tcPr>
+          <w:p>
+            <w:r>
+              <w:t xml:space="preserve">Contracts expiring within a window — recompete targets</w:t>
             </w:r>
           </w:p>
         </w:tc>
@@ -948,28 +948,28 @@
                 <w:color w:val="5B34D6"/>
                 <w:shd w:fill="EEF1F8"/>
               </w:rPr>
-              <w:t xml:space="preserve">get_expiring_contracts</w:t>
-            </w:r>
-          </w:p>
-        </w:tc>
-        <w:tc>
-          <w:tcPr>
-            <w:tcBorders>
-              <w:top w:val="single" w:color="D5D9E4" w:sz="4"/>
-              <w:left w:val="single" w:color="D5D9E4" w:sz="4"/>
-              <w:bottom w:val="single" w:color="D5D9E4" w:sz="4"/>
-              <w:right w:val="single" w:color="D5D9E4" w:sz="4"/>
-            </w:tcBorders>
-            <w:tcMar>
-              <w:top w:type="dxa" w:w="60"/>
-              <w:left w:type="dxa" w:w="120"/>
-              <w:bottom w:type="dxa" w:w="60"/>
-              <w:right w:type="dxa" w:w="120"/>
-            </w:tcMar>
-          </w:tcPr>
-          <w:p>
-            <w:r>
-              <w:t xml:space="preserve">Contracts expiring within a window — recompete targets</w:t>
+              <w:t xml:space="preserve">match_recompete_sow</w:t>
+            </w:r>
+          </w:p>
+        </w:tc>
+        <w:tc>
+          <w:tcPr>
+            <w:tcBorders>
+              <w:top w:val="single" w:color="D5D9E4" w:sz="4"/>
+              <w:left w:val="single" w:color="D5D9E4" w:sz="4"/>
+              <w:bottom w:val="single" w:color="D5D9E4" w:sz="4"/>
+              <w:right w:val="single" w:color="D5D9E4" w:sz="4"/>
+            </w:tcBorders>
+            <w:tcMar>
+              <w:top w:type="dxa" w:w="60"/>
+              <w:left w:type="dxa" w:w="120"/>
+              <w:bottom w:type="dxa" w:w="60"/>
+              <w:right w:type="dxa" w:w="120"/>
+            </w:tcMar>
+          </w:tcPr>
+          <w:p>
+            <w:r>
+              <w:t xml:space="preserve">Given an expiring contract's scope, the open solicitation that is likely its recompete — by semantic SOW similarity, not keywords</w:t>
             </w:r>
           </w:p>
         </w:tc>
@@ -997,28 +997,28 @@
                 <w:color w:val="5B34D6"/>
                 <w:shd w:fill="EEF1F8"/>
               </w:rPr>
-              <w:t xml:space="preserve">match_recompete_sow</w:t>
-            </w:r>
-          </w:p>
-        </w:tc>
-        <w:tc>
-          <w:tcPr>
-            <w:tcBorders>
-              <w:top w:val="single" w:color="D5D9E4" w:sz="4"/>
-              <w:left w:val="single" w:color="D5D9E4" w:sz="4"/>
-              <w:bottom w:val="single" w:color="D5D9E4" w:sz="4"/>
-              <w:right w:val="single" w:color="D5D9E4" w:sz="4"/>
-            </w:tcBorders>
-            <w:tcMar>
-              <w:top w:type="dxa" w:w="60"/>
-              <w:left w:type="dxa" w:w="120"/>
-              <w:bottom w:type="dxa" w:w="60"/>
-              <w:right w:type="dxa" w:w="120"/>
-            </w:tcMar>
-          </w:tcPr>
-          <w:p>
-            <w:r>
-              <w:t xml:space="preserve">Given an expiring contract's scope, the open solicitation that is likely its recompete — by semantic SOW similarity, not keywords</w:t>
+              <w:t xml:space="preserve">search_idv_contracts</w:t>
+            </w:r>
+          </w:p>
+        </w:tc>
+        <w:tc>
+          <w:tcPr>
+            <w:tcBorders>
+              <w:top w:val="single" w:color="D5D9E4" w:sz="4"/>
+              <w:left w:val="single" w:color="D5D9E4" w:sz="4"/>
+              <w:bottom w:val="single" w:color="D5D9E4" w:sz="4"/>
+              <w:right w:val="single" w:color="D5D9E4" w:sz="4"/>
+            </w:tcBorders>
+            <w:tcMar>
+              <w:top w:type="dxa" w:w="60"/>
+              <w:left w:type="dxa" w:w="120"/>
+              <w:bottom w:type="dxa" w:w="60"/>
+              <w:right w:type="dxa" w:w="120"/>
+            </w:tcMar>
+          </w:tcPr>
+          <w:p>
+            <w:r>
+              <w:t xml:space="preserve">IDIQ / GWAC / BPA vehicles + the task orders flowing through them</w:t>
             </w:r>
           </w:p>
         </w:tc>
@@ -1046,55 +1046,6 @@
                 <w:color w:val="5B34D6"/>
                 <w:shd w:fill="EEF1F8"/>
               </w:rPr>
-              <w:t xml:space="preserve">search_idv_contracts</w:t>
-            </w:r>
-          </w:p>
-        </w:tc>
-        <w:tc>
-          <w:tcPr>
-            <w:tcBorders>
-              <w:top w:val="single" w:color="D5D9E4" w:sz="4"/>
-              <w:left w:val="single" w:color="D5D9E4" w:sz="4"/>
-              <w:bottom w:val="single" w:color="D5D9E4" w:sz="4"/>
-              <w:right w:val="single" w:color="D5D9E4" w:sz="4"/>
-            </w:tcBorders>
-            <w:tcMar>
-              <w:top w:type="dxa" w:w="60"/>
-              <w:left w:type="dxa" w:w="120"/>
-              <w:bottom w:type="dxa" w:w="60"/>
-              <w:right w:type="dxa" w:w="120"/>
-            </w:tcMar>
-          </w:tcPr>
-          <w:p>
-            <w:r>
-              <w:t xml:space="preserve">IDIQ / GWAC / BPA vehicles + the task orders flowing through them</w:t>
-            </w:r>
-          </w:p>
-        </w:tc>
-      </w:tr>
-      <w:tr>
-        <w:tc>
-          <w:tcPr>
-            <w:tcBorders>
-              <w:top w:val="single" w:color="D5D9E4" w:sz="4"/>
-              <w:left w:val="single" w:color="D5D9E4" w:sz="4"/>
-              <w:bottom w:val="single" w:color="D5D9E4" w:sz="4"/>
-              <w:right w:val="single" w:color="D5D9E4" w:sz="4"/>
-            </w:tcBorders>
-            <w:tcMar>
-              <w:top w:type="dxa" w:w="60"/>
-              <w:left w:type="dxa" w:w="120"/>
-              <w:bottom w:type="dxa" w:w="60"/>
-              <w:right w:type="dxa" w:w="120"/>
-            </w:tcMar>
-          </w:tcPr>
-          <w:p>
-            <w:r>
-              <w:rPr>
-                <w:rFonts w:ascii="Consolas" w:cs="Consolas" w:eastAsia="Consolas" w:hAnsi="Consolas"/>
-                <w:color w:val="5B34D6"/>
-                <w:shd w:fill="EEF1F8"/>
-              </w:rPr>
               <w:t xml:space="preserve">get_solicitation_documents</w:t>
             </w:r>
           </w:p>
@@ -1117,55 +1068,6 @@
           <w:p>
             <w:r>
               <w:t xml:space="preserve">Full SOW/PWS + attachments for a notice</w:t>
-            </w:r>
-          </w:p>
-        </w:tc>
-      </w:tr>
-      <w:tr>
-        <w:tc>
-          <w:tcPr>
-            <w:tcBorders>
-              <w:top w:val="single" w:color="D5D9E4" w:sz="4"/>
-              <w:left w:val="single" w:color="D5D9E4" w:sz="4"/>
-              <w:bottom w:val="single" w:color="D5D9E4" w:sz="4"/>
-              <w:right w:val="single" w:color="D5D9E4" w:sz="4"/>
-            </w:tcBorders>
-            <w:tcMar>
-              <w:top w:type="dxa" w:w="60"/>
-              <w:left w:type="dxa" w:w="120"/>
-              <w:bottom w:type="dxa" w:w="60"/>
-              <w:right w:type="dxa" w:w="120"/>
-            </w:tcMar>
-          </w:tcPr>
-          <w:p>
-            <w:r>
-              <w:rPr>
-                <w:rFonts w:ascii="Consolas" w:cs="Consolas" w:eastAsia="Consolas" w:hAnsi="Consolas"/>
-                <w:color w:val="5B34D6"/>
-                <w:shd w:fill="EEF1F8"/>
-              </w:rPr>
-              <w:t xml:space="preserve">extract_statement_of_work</w:t>
-            </w:r>
-          </w:p>
-        </w:tc>
-        <w:tc>
-          <w:tcPr>
-            <w:tcBorders>
-              <w:top w:val="single" w:color="D5D9E4" w:sz="4"/>
-              <w:left w:val="single" w:color="D5D9E4" w:sz="4"/>
-              <w:bottom w:val="single" w:color="D5D9E4" w:sz="4"/>
-              <w:right w:val="single" w:color="D5D9E4" w:sz="4"/>
-            </w:tcBorders>
-            <w:tcMar>
-              <w:top w:type="dxa" w:w="60"/>
-              <w:left w:type="dxa" w:w="120"/>
-              <w:bottom w:type="dxa" w:w="60"/>
-              <w:right w:type="dxa" w:w="120"/>
-            </w:tcMar>
-          </w:tcPr>
-          <w:p>
-            <w:r>
-              <w:t xml:space="preserve">The SOW/PWS/SOO pulled out as clean text — recovers scope buried in a Section C blob, with a CLIN-scope fallback</w:t>
             </w:r>
           </w:p>
         </w:tc>
@@ -1580,55 +1482,6 @@
                 <w:color w:val="5B34D6"/>
                 <w:shd w:fill="EEF1F8"/>
               </w:rPr>
-              <w:t xml:space="preserve">get_incumbent_financials</w:t>
-            </w:r>
-          </w:p>
-        </w:tc>
-        <w:tc>
-          <w:tcPr>
-            <w:tcBorders>
-              <w:top w:val="single" w:color="D5D9E4" w:sz="4"/>
-              <w:left w:val="single" w:color="D5D9E4" w:sz="4"/>
-              <w:bottom w:val="single" w:color="D5D9E4" w:sz="4"/>
-              <w:right w:val="single" w:color="D5D9E4" w:sz="4"/>
-            </w:tcBorders>
-            <w:tcMar>
-              <w:top w:type="dxa" w:w="60"/>
-              <w:left w:type="dxa" w:w="120"/>
-              <w:bottom w:type="dxa" w:w="60"/>
-              <w:right w:type="dxa" w:w="120"/>
-            </w:tcMar>
-          </w:tcPr>
-          <w:p>
-            <w:r>
-              <w:t xml:space="preserve">Public-filer financials from SEC EDGAR (revenue, margin, 10-K)</w:t>
-            </w:r>
-          </w:p>
-        </w:tc>
-      </w:tr>
-      <w:tr>
-        <w:tc>
-          <w:tcPr>
-            <w:tcBorders>
-              <w:top w:val="single" w:color="D5D9E4" w:sz="4"/>
-              <w:left w:val="single" w:color="D5D9E4" w:sz="4"/>
-              <w:bottom w:val="single" w:color="D5D9E4" w:sz="4"/>
-              <w:right w:val="single" w:color="D5D9E4" w:sz="4"/>
-            </w:tcBorders>
-            <w:tcMar>
-              <w:top w:type="dxa" w:w="60"/>
-              <w:left w:type="dxa" w:w="120"/>
-              <w:bottom w:type="dxa" w:w="60"/>
-              <w:right w:type="dxa" w:w="120"/>
-            </w:tcMar>
-          </w:tcPr>
-          <w:p>
-            <w:r>
-              <w:rPr>
-                <w:rFonts w:ascii="Consolas" w:cs="Consolas" w:eastAsia="Consolas" w:hAnsi="Consolas"/>
-                <w:color w:val="5B34D6"/>
-                <w:shd w:fill="EEF1F8"/>
-              </w:rPr>
               <w:t xml:space="preserve">get_pricing_intel</w:t>
             </w:r>
           </w:p>
@@ -2016,28 +1869,28 @@
                 <w:color w:val="5B34D6"/>
                 <w:shd w:fill="EEF1F8"/>
               </w:rPr>
-              <w:t xml:space="preserve">get_agency_budget_trends</w:t>
-            </w:r>
-          </w:p>
-        </w:tc>
-        <w:tc>
-          <w:tcPr>
-            <w:tcBorders>
-              <w:top w:val="single" w:color="D5D9E4" w:sz="4"/>
-              <w:left w:val="single" w:color="D5D9E4" w:sz="4"/>
-              <w:bottom w:val="single" w:color="D5D9E4" w:sz="4"/>
-              <w:right w:val="single" w:color="D5D9E4" w:sz="4"/>
-            </w:tcBorders>
-            <w:tcMar>
-              <w:top w:type="dxa" w:w="60"/>
-              <w:left w:type="dxa" w:w="120"/>
-              <w:bottom w:type="dxa" w:w="60"/>
-              <w:right w:type="dxa" w:w="120"/>
-            </w:tcMar>
-          </w:tcPr>
-          <w:p>
-            <w:r>
-              <w:t xml:space="preserve">FY-over-FY discretionary budget-authority trend (growing / cut)</w:t>
+              <w:t xml:space="preserve">get_award_detail</w:t>
+            </w:r>
+          </w:p>
+        </w:tc>
+        <w:tc>
+          <w:tcPr>
+            <w:tcBorders>
+              <w:top w:val="single" w:color="D5D9E4" w:sz="4"/>
+              <w:left w:val="single" w:color="D5D9E4" w:sz="4"/>
+              <w:bottom w:val="single" w:color="D5D9E4" w:sz="4"/>
+              <w:right w:val="single" w:color="D5D9E4" w:sz="4"/>
+            </w:tcBorders>
+            <w:tcMar>
+              <w:top w:type="dxa" w:w="60"/>
+              <w:left w:type="dxa" w:w="120"/>
+              <w:bottom w:type="dxa" w:w="60"/>
+              <w:right w:type="dxa" w:w="120"/>
+            </w:tcMar>
+          </w:tcPr>
+          <w:p>
+            <w:r>
+              <w:t xml:space="preserve">Obligated-to-ceiling, parent IDV, period of performance, recipient</w:t>
             </w:r>
           </w:p>
         </w:tc>
@@ -2065,55 +1918,6 @@
                 <w:color w:val="5B34D6"/>
                 <w:shd w:fill="EEF1F8"/>
               </w:rPr>
-              <w:t xml:space="preserve">get_award_detail</w:t>
-            </w:r>
-          </w:p>
-        </w:tc>
-        <w:tc>
-          <w:tcPr>
-            <w:tcBorders>
-              <w:top w:val="single" w:color="D5D9E4" w:sz="4"/>
-              <w:left w:val="single" w:color="D5D9E4" w:sz="4"/>
-              <w:bottom w:val="single" w:color="D5D9E4" w:sz="4"/>
-              <w:right w:val="single" w:color="D5D9E4" w:sz="4"/>
-            </w:tcBorders>
-            <w:tcMar>
-              <w:top w:type="dxa" w:w="60"/>
-              <w:left w:type="dxa" w:w="120"/>
-              <w:bottom w:type="dxa" w:w="60"/>
-              <w:right w:type="dxa" w:w="120"/>
-            </w:tcMar>
-          </w:tcPr>
-          <w:p>
-            <w:r>
-              <w:t xml:space="preserve">Obligated-to-ceiling, parent IDV, period of performance, recipient</w:t>
-            </w:r>
-          </w:p>
-        </w:tc>
-      </w:tr>
-      <w:tr>
-        <w:tc>
-          <w:tcPr>
-            <w:tcBorders>
-              <w:top w:val="single" w:color="D5D9E4" w:sz="4"/>
-              <w:left w:val="single" w:color="D5D9E4" w:sz="4"/>
-              <w:bottom w:val="single" w:color="D5D9E4" w:sz="4"/>
-              <w:right w:val="single" w:color="D5D9E4" w:sz="4"/>
-            </w:tcBorders>
-            <w:tcMar>
-              <w:top w:type="dxa" w:w="60"/>
-              <w:left w:type="dxa" w:w="120"/>
-              <w:bottom w:type="dxa" w:w="60"/>
-              <w:right w:type="dxa" w:w="120"/>
-            </w:tcMar>
-          </w:tcPr>
-          <w:p>
-            <w:r>
-              <w:rPr>
-                <w:rFonts w:ascii="Consolas" w:cs="Consolas" w:eastAsia="Consolas" w:hAnsi="Consolas"/>
-                <w:color w:val="5B34D6"/>
-                <w:shd w:fill="EEF1F8"/>
-              </w:rPr>
               <w:t xml:space="preserve">find_predecessor_award</w:t>
             </w:r>
           </w:p>
@@ -2136,55 +1940,6 @@
           <w:p>
             <w:r>
               <w:t xml:space="preserve">The likely incumbent for an open opportunity</w:t>
-            </w:r>
-          </w:p>
-        </w:tc>
-      </w:tr>
-      <w:tr>
-        <w:tc>
-          <w:tcPr>
-            <w:tcBorders>
-              <w:top w:val="single" w:color="D5D9E4" w:sz="4"/>
-              <w:left w:val="single" w:color="D5D9E4" w:sz="4"/>
-              <w:bottom w:val="single" w:color="D5D9E4" w:sz="4"/>
-              <w:right w:val="single" w:color="D5D9E4" w:sz="4"/>
-            </w:tcBorders>
-            <w:tcMar>
-              <w:top w:type="dxa" w:w="60"/>
-              <w:left w:type="dxa" w:w="120"/>
-              <w:bottom w:type="dxa" w:w="60"/>
-              <w:right w:type="dxa" w:w="120"/>
-            </w:tcMar>
-          </w:tcPr>
-          <w:p>
-            <w:r>
-              <w:rPr>
-                <w:rFonts w:ascii="Consolas" w:cs="Consolas" w:eastAsia="Consolas" w:hAnsi="Consolas"/>
-                <w:color w:val="5B34D6"/>
-                <w:shd w:fill="EEF1F8"/>
-              </w:rPr>
-              <w:t xml:space="preserve">get_regulatory_demand</w:t>
-            </w:r>
-          </w:p>
-        </w:tc>
-        <w:tc>
-          <w:tcPr>
-            <w:tcBorders>
-              <w:top w:val="single" w:color="D5D9E4" w:sz="4"/>
-              <w:left w:val="single" w:color="D5D9E4" w:sz="4"/>
-              <w:bottom w:val="single" w:color="D5D9E4" w:sz="4"/>
-              <w:right w:val="single" w:color="D5D9E4" w:sz="4"/>
-            </w:tcBorders>
-            <w:tcMar>
-              <w:top w:type="dxa" w:w="60"/>
-              <w:left w:type="dxa" w:w="120"/>
-              <w:bottom w:type="dxa" w:w="60"/>
-              <w:right w:type="dxa" w:w="120"/>
-            </w:tcMar>
-          </w:tcPr>
-          <w:p>
-            <w:r>
-              <w:t xml:space="preserve">Federal Register signals — "demand before SAM," 6–18 months early</w:t>
             </w:r>
           </w:p>
         </w:tc>
@@ -2763,55 +2518,6 @@
                 <w:color w:val="5B34D6"/>
                 <w:shd w:fill="EEF1F8"/>
               </w:rPr>
-              <w:t xml:space="preserve">build_proposal_structure</w:t>
-            </w:r>
-          </w:p>
-        </w:tc>
-        <w:tc>
-          <w:tcPr>
-            <w:tcBorders>
-              <w:top w:val="single" w:color="D5D9E4" w:sz="4"/>
-              <w:left w:val="single" w:color="D5D9E4" w:sz="4"/>
-              <w:bottom w:val="single" w:color="D5D9E4" w:sz="4"/>
-              <w:right w:val="single" w:color="D5D9E4" w:sz="4"/>
-            </w:tcBorders>
-            <w:tcMar>
-              <w:top w:type="dxa" w:w="60"/>
-              <w:left w:type="dxa" w:w="120"/>
-              <w:bottom w:type="dxa" w:w="60"/>
-              <w:right w:type="dxa" w:w="120"/>
-            </w:tcMar>
-          </w:tcPr>
-          <w:p>
-            <w:r>
-              <w:t xml:space="preserve">The compliance matrix → the volume/section outline the proposal must follow</w:t>
-            </w:r>
-          </w:p>
-        </w:tc>
-      </w:tr>
-      <w:tr>
-        <w:tc>
-          <w:tcPr>
-            <w:tcBorders>
-              <w:top w:val="single" w:color="D5D9E4" w:sz="4"/>
-              <w:left w:val="single" w:color="D5D9E4" w:sz="4"/>
-              <w:bottom w:val="single" w:color="D5D9E4" w:sz="4"/>
-              <w:right w:val="single" w:color="D5D9E4" w:sz="4"/>
-            </w:tcBorders>
-            <w:tcMar>
-              <w:top w:type="dxa" w:w="60"/>
-              <w:left w:type="dxa" w:w="120"/>
-              <w:bottom w:type="dxa" w:w="60"/>
-              <w:right w:type="dxa" w:w="120"/>
-            </w:tcMar>
-          </w:tcPr>
-          <w:p>
-            <w:r>
-              <w:rPr>
-                <w:rFonts w:ascii="Consolas" w:cs="Consolas" w:eastAsia="Consolas" w:hAnsi="Consolas"/>
-                <w:color w:val="5B34D6"/>
-                <w:shd w:fill="EEF1F8"/>
-              </w:rPr>
               <w:t xml:space="preserve">scan_proposal_compliance</w:t>
             </w:r>
           </w:p>
@@ -3116,10 +2822,10 @@
           <w:color w:val="5B34D6"/>
           <w:shd w:fill="EEF1F8"/>
         </w:rPr>
-        <w:t xml:space="preserve">get_incumbent_financials("Acme Integrated LLC")</w:t>
-      </w:r>
-      <w:r>
-        <w:t xml:space="preserve">. Acme is a private contractor with no SEC filing. A naïve tool would hallucinate a revenue figure. Mindy returns </w:t>
+        <w:t xml:space="preserve">get_contractor_profile("Acme Integrated LLC")</w:t>
+      </w:r>
+      <w:r>
+        <w:t xml:space="preserve">. Acme has no rows in the federal award index. A naïve tool would hallucinate an award history. Mindy returns </w:t>
       </w:r>
       <w:r>
         <w:rPr>
@@ -3127,7 +2833,7 @@
           <w:color w:val="5B34D6"/>
           <w:shd w:fill="EEF1F8"/>
         </w:rPr>
-        <w:t xml:space="preserve">grounded: false</w:t>
+        <w:t xml:space="preserve">resolution: none_in_award_corpus</w:t>
       </w:r>
       <w:r>
         <w:t xml:space="preserve"> and the honest instruction: </w:t>
@@ -3137,7 +2843,7 @@
           <w:i/>
           <w:iCs/>
         </w:rPr>
-        <w:t xml:space="preserve">no EDGAR filing exists — the company is likely private; do not invent financials; use the contractor-profile tool for its federal award history instead.</w:t>
+        <w:t xml:space="preserve">zero rows in this dataset is not proof the company has no federal awards; do not invent figures; check its SAM registration with the entity tool instead.</w:t>
       </w:r>
       <w:r>
         <w:t xml:space="preserve"> The agent tells the truth because the data told the truth.</w:t>
@@ -3285,101 +2991,78 @@
         <w:t xml:space="preserve">2.  </w:t>
       </w:r>
       <w:r>
+        <w:t xml:space="preserve">The agent drafts each section — using its own model, grounded in the requirements.</w:t>
+      </w:r>
+    </w:p>
+    <w:p>
+      <w:pPr>
+        <w:spacing w:after="60"/>
+        <w:ind w:left="360" w:hanging="240"/>
+      </w:pPr>
+      <w:r>
         <w:rPr>
           <w:b/>
           <w:bCs/>
         </w:rPr>
-        <w:t xml:space="preserve">`build_proposal_structure`</w:t>
-      </w:r>
-      <w:r>
-        <w:t xml:space="preserve"> turns that matrix into the volume → section outline the proposal must follow, with the critical deadline/cert items surfaced up front and the cross-cutting format rules that apply to every volume.</w:t>
-      </w:r>
-    </w:p>
-    <w:p>
-      <w:pPr>
-        <w:spacing w:after="60"/>
-        <w:ind w:left="360" w:hanging="240"/>
-      </w:pPr>
+        <w:t xml:space="preserve">3.  </w:t>
+      </w:r>
       <w:r>
         <w:rPr>
           <w:b/>
           <w:bCs/>
         </w:rPr>
-        <w:t xml:space="preserve">3.  </w:t>
-      </w:r>
-      <w:r>
-        <w:t xml:space="preserve">The agent drafts each section — using its own model, grounded in the requirements.</w:t>
-      </w:r>
-    </w:p>
-    <w:p>
-      <w:pPr>
-        <w:spacing w:after="60"/>
-        <w:ind w:left="360" w:hanging="240"/>
-      </w:pPr>
+        <w:t xml:space="preserve">`referee_proposal_compliance`</w:t>
+      </w:r>
+      <w:r>
+        <w:t xml:space="preserve"> runs the assembled draft past an </w:t>
+      </w:r>
       <w:r>
         <w:rPr>
           <w:b/>
           <w:bCs/>
         </w:rPr>
-        <w:t xml:space="preserve">4.  </w:t>
+        <w:t xml:space="preserve">independent</w:t>
+      </w:r>
+      <w:r>
+        <w:t xml:space="preserve"> model that did </w:t>
+      </w:r>
+      <w:r>
+        <w:rPr>
+          <w:i/>
+          <w:iCs/>
+        </w:rPr>
+        <w:t xml:space="preserve">not</w:t>
+      </w:r>
+      <w:r>
+        <w:t xml:space="preserve"> write it, for a per-requirement verdict — met / partial / missing, with evidence and a compliance score. Independence is the point: the drafter thinks it's done; a fresh referee catches the unmet "shall" items before submission.</w:t>
+      </w:r>
+    </w:p>
+    <w:p>
+      <w:pPr>
+        <w:spacing w:after="120"/>
+      </w:pPr>
+      <w:r>
+        <w:t xml:space="preserve">Alongside the chain, </w:t>
       </w:r>
       <w:r>
         <w:rPr>
           <w:b/>
           <w:bCs/>
         </w:rPr>
-        <w:t xml:space="preserve">`referee_proposal_compliance`</w:t>
-      </w:r>
-      <w:r>
-        <w:t xml:space="preserve"> runs the assembled draft past an </w:t>
+        <w:t xml:space="preserve">`match_recompete_sow`</w:t>
+      </w:r>
+      <w:r>
+        <w:t xml:space="preserve"> closes the recompete loop — hand it an expiring contract's scope and it finds the open solicitation that is likely its recompete by semantic SOW similarity, and </w:t>
       </w:r>
       <w:r>
         <w:rPr>
           <w:b/>
           <w:bCs/>
         </w:rPr>
-        <w:t xml:space="preserve">independent</w:t>
-      </w:r>
-      <w:r>
-        <w:t xml:space="preserve"> model that did </w:t>
-      </w:r>
-      <w:r>
-        <w:rPr>
-          <w:i/>
-          <w:iCs/>
-        </w:rPr>
-        <w:t xml:space="preserve">not</w:t>
-      </w:r>
-      <w:r>
-        <w:t xml:space="preserve"> write it, for a per-requirement verdict — met / partial / missing, with evidence and a compliance score. Independence is the point: the drafter thinks it's done; a fresh referee catches the unmet "shall" items before submission.</w:t>
-      </w:r>
-    </w:p>
-    <w:p>
-      <w:pPr>
-        <w:spacing w:after="120"/>
-      </w:pPr>
-      <w:r>
-        <w:t xml:space="preserve">Alongside the chain, </w:t>
-      </w:r>
-      <w:r>
-        <w:rPr>
-          <w:b/>
-          <w:bCs/>
-        </w:rPr>
-        <w:t xml:space="preserve">`match_recompete_sow`</w:t>
-      </w:r>
-      <w:r>
-        <w:t xml:space="preserve"> closes the recompete loop — hand it an expiring contract's scope and it finds the open solicitation that is likely its recompete by semantic SOW similarity, and </w:t>
-      </w:r>
-      <w:r>
-        <w:rPr>
-          <w:b/>
-          <w:bCs/>
-        </w:rPr>
-        <w:t xml:space="preserve">`extract_statement_of_work`</w:t>
-      </w:r>
-      <w:r>
-        <w:t xml:space="preserve"> pulls a clean scope out of a combined solicitation to hand to subs.</w:t>
+        <w:t xml:space="preserve">`get_solicitation_documents`</w:t>
+      </w:r>
+      <w:r>
+        <w:t xml:space="preserve"> pulls the full SOW/PWS and attachments as text to hand to subs.</w:t>
       </w:r>
     </w:p>
     <w:p>
@@ -3435,7 +3118,7 @@
         <w:spacing w:after="120"/>
       </w:pPr>
       <w:r>
-        <w:t xml:space="preserve">An agent connects, and its owner funds a credit balance; each call debits on success. A failed or empty call costs nothing.</w:t>
+        <w:t xml:space="preserve">An agent connects, and its owner funds a credit balance; each call debits when Mindy does the research. A measured search that honestly finds nothing is still a paid answer. A call that does no work (a refused request, a failure on Mindy's side, or a call stopped before it runs) costs nothing.</w:t>
       </w:r>
     </w:p>
     <w:p>
@@ -4512,7 +4195,7 @@
           <w:b/>
           <w:bCs/>
         </w:rPr>
-        <w:t xml:space="preserve">64 tools</w:t>
+        <w:t xml:space="preserve">53 tools</w:t>
       </w:r>
       <w:r>
         <w:t xml:space="preserve"> spanning the public data any agent needs, a full proposal pipeline, and the proprietary intelligence no competitor can copy, all under a contract that returns real data or honestly returns nothing.</w:t>

</xml_diff>